<commit_message>
Bozza privacy: dettaglio sui cookie tecnici (nessun banner necessario)
Co-Authored-By: Claude Opus 5.5 <noreply@anthropic.com>
</commit_message>
<xml_diff>
--- a/docs/legale/Magistra_bozze_testi_legali.docx
+++ b/docs/legale/Magistra_bozze_testi_legali.docx
@@ -1303,7 +1303,18 @@
           <w:sz w:val="22"/>
           <w:szCs w:val="22"/>
         </w:rPr>
-        <w:t xml:space="preserve">Il portale usa solo cookie tecnici necessari all'accesso e alla sicurezza della sessione. Non usa cookie di profilazione né strumenti di statistica di terze parti; per questo non è richiesto un consenso ai cookie.</w:t>
+        <w:t xml:space="preserve">Il portale usa solo cookie tecnici, necessari a mantenere l'accesso all'area riservata: il cookie "sb-…-auth-token" viene creato solo dopo l'accesso, conserva la sessione dell'utente collegato, dura al massimo 400 giorni e viene eliminato con il pulsante "Esci". I visitatori non collegati non ricevono alcun cookie. Il portale non usa cookie di profilazione, strumenti di statistica di terze parti, pulsanti social o contenuti incorporati da altri siti: per questo, secondo le Linee guida del Garante per la protezione dei dati personali del 10 giugno 2021 su cookie e altri strumenti di tracciamento, non è richiesto un consenso ai cookie. </w:t>
+      </w:r>
+      <w:r>
+        <w:rPr>
+          <w:rFonts w:ascii="Calibri" w:cs="Calibri" w:eastAsia="Calibri" w:hAnsi="Calibri"/>
+          <w:b/>
+          <w:bCs/>
+          <w:sz w:val="22"/>
+          <w:szCs w:val="22"/>
+          <w:highlight w:val="yellow"/>
+        </w:rPr>
+        <w:t xml:space="preserve">[DA VERIFICARE: durata del cookie di sessione]</w:t>
       </w:r>
     </w:p>
     <w:p>

</xml_diff>